<commit_message>
Trang dùng chung: QR2-4 sang nhóm Giảng viên, nhãn đối tượng, bỏ GV-BG, thông báo quá hạn trả; tờ trình mang tài sản ra nội dung mới
Co-Authored-By: Claude Opus 5.5 <noreply@anthropic.com>
</commit_message>
<xml_diff>
--- a/bieu-mau/Phieu-de-nghi-giai-quyet-cong-viec_mang-tai-san-ra.docx
+++ b/bieu-mau/Phieu-de-nghi-giai-quyet-cong-viec_mang-tai-san-ra.docx
@@ -401,7 +401,7 @@
                 <w:sz w:val="26"/>
                 <w:szCs w:val="26"/>
               </w:rPr>
-              <w:t xml:space="preserve">TP. Hồ Chí Minh, ngày…… tháng…… năm 20……</w:t>
+              <w:t xml:space="preserve">TP. Hồ Chí Minh, ngày… tháng… năm 20…</w:t>
             </w:r>
             <w:r>
               <w:rPr>
@@ -862,6 +862,7 @@
           <w:p>
             <w:pPr>
               <w:spacing w:before="120"/>
+              <w:ind w:firstLine="567"/>
               <w:jc w:val="both"/>
               <w:rPr>
                 <w:rFonts w:ascii="Times New Roman" w:hAnsi="Times New Roman" w:cs="Times New Roman"/>
@@ -873,42 +874,79 @@
                 <w:rFonts w:ascii="Times New Roman" w:hAnsi="Times New Roman" w:cs="Times New Roman"/>
                 <w:lang w:val="vi-VN"/>
               </w:rPr>
-              <w:t xml:space="preserve">    Giảng viên: ……………………………… Bộ môn: ………………… Điện thoại: ……………… đề nghị được mang các tài sản sau ra khỏi cơ quan vào ngày ……/……/20……: ………………………………………………………………………………………… Lý do: ………………………………………………………………… Các tài sản trên đã được mang vào cơ quan theo Giấy báo mang tài sản vào cơ quan ngày ……/……/20…… (đính kèm). Khoa Khoa học Sức khỏe kính trình Ban Giám hiệu xem xét và giải quyết.</w:t>
-            </w:r>
-            <w:r>
-              <w:rPr>
-                <w:rFonts w:ascii="Times New Roman" w:hAnsi="Times New Roman" w:cs="Times New Roman"/>
-                <w:lang w:val="vi-VN"/>
-              </w:rPr>
-              <w:t/>
-            </w:r>
-            <w:r>
-              <w:rPr>
-                <w:rFonts w:ascii="Times New Roman" w:hAnsi="Times New Roman" w:cs="Times New Roman"/>
-                <w:lang w:val="vi-VN"/>
-              </w:rPr>
-              <w:t xml:space="preserve"/>
-            </w:r>
-            <w:r>
-              <w:rPr>
-                <w:rFonts w:ascii="Times New Roman" w:hAnsi="Times New Roman" w:cs="Times New Roman"/>
-                <w:lang w:val="vi-VN"/>
-              </w:rPr>
-              <w:t/>
-            </w:r>
-            <w:r>
-              <w:rPr>
-                <w:rFonts w:ascii="Times New Roman" w:hAnsi="Times New Roman" w:cs="Times New Roman"/>
-                <w:lang w:val="vi-VN"/>
-              </w:rPr>
-              <w:t/>
-            </w:r>
-            <w:r>
-              <w:rPr>
-                <w:rFonts w:ascii="Times New Roman" w:hAnsi="Times New Roman" w:cs="Times New Roman"/>
-                <w:lang w:val="vi-VN"/>
-              </w:rPr>
-              <w:t xml:space="preserve"/>
+              <w:t xml:space="preserve">Khoa Khoa học Sức khỏe nhận được đề nghị của giảng viên ………………………………, Bộ môn ………………………, số điện thoại ……………………, về việc mang tài sản ra khỏi cơ quan, cụ thể như sau:</w:t>
+            </w:r>
+          </w:p>
+          <w:p>
+            <w:pPr>
+              <w:spacing w:before="120"/>
+              <w:ind w:left="567"/>
+              <w:jc w:val="left"/>
+              <w:rPr>
+                <w:rFonts w:ascii="Times New Roman" w:hAnsi="Times New Roman" w:cs="Times New Roman"/>
+                <w:lang w:val="vi-VN"/>
+              </w:rPr>
+            </w:pPr>
+            <w:r>
+              <w:rPr>
+                <w:rFonts w:ascii="Times New Roman" w:hAnsi="Times New Roman" w:cs="Times New Roman"/>
+                <w:lang w:val="vi-VN"/>
+              </w:rPr>
+              <w:t xml:space="preserve">•  Tên tài sản: ………………………………………………………………</w:t>
+            </w:r>
+          </w:p>
+          <w:p>
+            <w:pPr>
+              <w:spacing w:before="120"/>
+              <w:ind w:left="567"/>
+              <w:jc w:val="left"/>
+              <w:rPr>
+                <w:rFonts w:ascii="Times New Roman" w:hAnsi="Times New Roman" w:cs="Times New Roman"/>
+                <w:lang w:val="vi-VN"/>
+              </w:rPr>
+            </w:pPr>
+            <w:r>
+              <w:rPr>
+                <w:rFonts w:ascii="Times New Roman" w:hAnsi="Times New Roman" w:cs="Times New Roman"/>
+                <w:lang w:val="vi-VN"/>
+              </w:rPr>
+              <w:t xml:space="preserve">•  Lý do đem ra: ……………………………………………………………</w:t>
+            </w:r>
+          </w:p>
+          <w:p>
+            <w:pPr>
+              <w:spacing w:before="120"/>
+              <w:ind w:firstLine="567"/>
+              <w:jc w:val="both"/>
+              <w:rPr>
+                <w:rFonts w:ascii="Times New Roman" w:hAnsi="Times New Roman" w:cs="Times New Roman"/>
+                <w:lang w:val="vi-VN"/>
+              </w:rPr>
+            </w:pPr>
+            <w:r>
+              <w:rPr>
+                <w:rFonts w:ascii="Times New Roman" w:hAnsi="Times New Roman" w:cs="Times New Roman"/>
+                <w:lang w:val="vi-VN"/>
+              </w:rPr>
+              <w:t xml:space="preserve">Các tài sản trên do giảng viên mang vào cơ quan theo Giấy báo mang tài sản vào cơ quan ngày ……/……/20…… (đính kèm) để phục vụ nghiên cứu khoa học và không thuộc tài sản của Trường.</w:t>
+            </w:r>
+          </w:p>
+          <w:p>
+            <w:pPr>
+              <w:spacing w:before="120"/>
+              <w:ind w:firstLine="567"/>
+              <w:jc w:val="both"/>
+              <w:rPr>
+                <w:rFonts w:ascii="Times New Roman" w:hAnsi="Times New Roman" w:cs="Times New Roman"/>
+                <w:lang w:val="vi-VN"/>
+              </w:rPr>
+            </w:pPr>
+            <w:r>
+              <w:rPr>
+                <w:rFonts w:ascii="Times New Roman" w:hAnsi="Times New Roman" w:cs="Times New Roman"/>
+                <w:lang w:val="vi-VN"/>
+              </w:rPr>
+              <w:t xml:space="preserve">Khoa Khoa học Sức khỏe kính trình Ban Giám hiệu xem xét, phê duyệt để giảng viên hoàn tất thủ tục theo Giấy báo mang tài sản ra khỏi cơ quan (mẫu số 28).</w:t>
             </w:r>
           </w:p>
           <w:p>
@@ -1117,7 +1155,7 @@
                 <w:rFonts w:ascii="Times New Roman" w:hAnsi="Times New Roman" w:cs="Times New Roman"/>
                 <w:lang w:val="vi-VN"/>
               </w:rPr>
-              <w:t xml:space="preserve">                                         GS.TS. Trần Đình Thắng </w:t>
+              <w:t xml:space="preserve">    Nguyễn Tấn Phú                GS.TS. Trần Đình Thắng </w:t>
             </w:r>
             <w:r>
               <w:rPr>

</xml_diff>